<commit_message>
something wicked this way comes
</commit_message>
<xml_diff>
--- a/assets/img/LukeFoxCV.docx
+++ b/assets/img/LukeFoxCV.docx
@@ -19,10 +19,10 @@
         <mc:AlternateContent>
           <mc:Choice Requires="wps">
             <w:drawing>
-              <wp:anchor distT="0" distB="0" distL="114300" distR="114300" simplePos="0" relativeHeight="251658240" behindDoc="1" locked="1" layoutInCell="1" allowOverlap="1" wp14:anchorId="55E914F3" wp14:editId="44A9CB30">
+              <wp:anchor distT="0" distB="0" distL="114300" distR="114300" simplePos="0" relativeHeight="251658240" behindDoc="1" locked="1" layoutInCell="1" allowOverlap="1" wp14:anchorId="55E914F3" wp14:editId="66A4B5C0">
                 <wp:simplePos x="0" y="0"/>
                 <wp:positionH relativeFrom="page">
-                  <wp:posOffset>4962525</wp:posOffset>
+                  <wp:align>right</wp:align>
                 </wp:positionH>
                 <wp:positionV relativeFrom="paragraph">
                   <wp:posOffset>-460375</wp:posOffset>
@@ -95,7 +95,7 @@
           </mc:Choice>
           <mc:Fallback>
             <w:pict>
-              <v:rect w14:anchorId="53A42088" id="Rectangle 1" o:spid="_x0000_s1026" alt="&quot;&quot;" style="position:absolute;margin-left:390.75pt;margin-top:-36.25pt;width:221pt;height:11in;z-index:-251658240;visibility:visible;mso-wrap-style:square;mso-width-percent:0;mso-height-percent:0;mso-wrap-distance-left:9pt;mso-wrap-distance-top:0;mso-wrap-distance-right:9pt;mso-wrap-distance-bottom:0;mso-position-horizontal:absolute;mso-position-horizontal-relative:page;mso-position-vertical:absolute;mso-position-vertical-relative:text;mso-width-percent:0;mso-height-percent:0;mso-width-relative:margin;mso-height-relative:margin;v-text-anchor:middle" o:gfxdata="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" fillcolor="#558ec7" stroked="f" strokeweight="1pt">
+              <v:rect w14:anchorId="3871F34B" id="Rectangle 1" o:spid="_x0000_s1026" alt="&quot;&quot;" style="position:absolute;margin-left:169.8pt;margin-top:-36.25pt;width:221pt;height:11in;z-index:-251658240;visibility:visible;mso-wrap-style:square;mso-width-percent:0;mso-height-percent:0;mso-wrap-distance-left:9pt;mso-wrap-distance-top:0;mso-wrap-distance-right:9pt;mso-wrap-distance-bottom:0;mso-position-horizontal:right;mso-position-horizontal-relative:page;mso-position-vertical:absolute;mso-position-vertical-relative:text;mso-width-percent:0;mso-height-percent:0;mso-width-relative:margin;mso-height-relative:margin;v-text-anchor:middle" o:gfxdata="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" fillcolor="#558ec7" stroked="f" strokeweight="1pt">
                 <v:fill opacity="32639f"/>
                 <w10:wrap anchorx="page"/>
                 <w10:anchorlock/>
@@ -158,6 +158,48 @@
                 <w:lang w:val="en-GB"/>
               </w:rPr>
               <w:t xml:space="preserve"> </w:t>
+            </w:r>
+            <w:r>
+              <w:rPr>
+                <w:b w:val="0"/>
+                <w:bCs w:val="0"/>
+                <w:color w:val="auto"/>
+                <w:lang w:val="en-GB"/>
+              </w:rPr>
+              <w:t xml:space="preserve">– </w:t>
+            </w:r>
+            <w:r>
+              <w:rPr>
+                <w:b w:val="0"/>
+                <w:bCs w:val="0"/>
+                <w:color w:val="auto"/>
+                <w:sz w:val="44"/>
+                <w:szCs w:val="44"/>
+                <w:lang w:val="en-GB"/>
+              </w:rPr>
+              <w:t>Avail</w:t>
+            </w:r>
+            <w:r>
+              <w:rPr>
+                <w:b w:val="0"/>
+                <w:bCs w:val="0"/>
+                <w:color w:val="auto"/>
+                <w:sz w:val="44"/>
+                <w:szCs w:val="44"/>
+                <w:lang w:val="en-GB"/>
+              </w:rPr>
+              <w:t>a</w:t>
+            </w:r>
+            <w:r>
+              <w:rPr>
+                <w:b w:val="0"/>
+                <w:bCs w:val="0"/>
+                <w:color w:val="auto"/>
+                <w:sz w:val="44"/>
+                <w:szCs w:val="44"/>
+                <w:lang w:val="en-GB"/>
+              </w:rPr>
+              <w:t>ble Now</w:t>
             </w:r>
             <w:r>
               <w:rPr>
@@ -417,6 +459,7 @@
               </w:placeholder>
               <w15:appearance w15:val="hidden"/>
             </w:sdtPr>
+            <w:sdtEndPr/>
             <w:sdtContent>
               <w:p>
                 <w:pPr>
@@ -613,7 +656,7 @@
                 </mc:Choice>
                 <mc:Fallback>
                   <w:pict>
-                    <v:line w14:anchorId="20E53092" id="Straight Connector 2" o:spid="_x0000_s1026" alt="Decorative" style="visibility:visible;mso-wrap-style:square;mso-left-percent:-10001;mso-top-percent:-10001;mso-position-horizontal:absolute;mso-position-horizontal-relative:char;mso-position-vertical:absolute;mso-position-vertical-relative:line;mso-left-percent:-10001;mso-top-percent:-10001" from="0,0" to="126.7pt,0" o:gfxdata="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" strokecolor="#043d68 [3215]" strokeweight=".5pt">
+                    <v:line w14:anchorId="0C9EA51A" id="Straight Connector 2" o:spid="_x0000_s1026" alt="Decorative" style="visibility:visible;mso-wrap-style:square;mso-left-percent:-10001;mso-top-percent:-10001;mso-position-horizontal:absolute;mso-position-horizontal-relative:char;mso-position-vertical:absolute;mso-position-vertical-relative:line;mso-left-percent:-10001;mso-top-percent:-10001" from="0,0" to="126.7pt,0" o:gfxdata="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" strokecolor="#043d68 [3215]" strokeweight=".5pt">
                       <v:stroke joinstyle="miter"/>
                       <w10:anchorlock/>
                     </v:line>
@@ -718,7 +761,7 @@
                 </mc:Choice>
                 <mc:Fallback>
                   <w:pict>
-                    <v:line w14:anchorId="2F46AAA4" id="Straight Connector 1" o:spid="_x0000_s1026" alt="Decorative" style="position:absolute;flip:y;z-index:-251655168;visibility:visible;mso-wrap-style:square;mso-width-percent:0;mso-height-percent:0;mso-wrap-distance-left:9pt;mso-wrap-distance-top:0;mso-wrap-distance-right:9pt;mso-wrap-distance-bottom:0;mso-position-horizontal:absolute;mso-position-horizontal-relative:text;mso-position-vertical:absolute;mso-position-vertical-relative:text;mso-width-percent:0;mso-height-percent:0;mso-width-relative:margin;mso-height-relative:margin" from="2.5pt,.05pt" to="131pt,.05pt" o:gfxdata="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" strokecolor="#043d68 [3215]" strokeweight=".5pt">
+                    <v:line w14:anchorId="1CEDDCB0" id="Straight Connector 1" o:spid="_x0000_s1026" alt="Decorative" style="position:absolute;flip:y;z-index:-251655168;visibility:visible;mso-wrap-style:square;mso-width-percent:0;mso-height-percent:0;mso-wrap-distance-left:9pt;mso-wrap-distance-top:0;mso-wrap-distance-right:9pt;mso-wrap-distance-bottom:0;mso-position-horizontal:absolute;mso-position-horizontal-relative:text;mso-position-vertical:absolute;mso-position-vertical-relative:text;mso-width-percent:0;mso-height-percent:0;mso-width-relative:margin;mso-height-relative:margin" from="2.5pt,.05pt" to="131pt,.05pt" o:gfxdata="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" strokecolor="#043d68 [3215]" strokeweight=".5pt">
                       <v:stroke joinstyle="miter"/>
                       <w10:wrap type="tight"/>
                     </v:line>
@@ -751,6 +794,7 @@
                 <w:showingPlcHdr/>
                 <w15:appearance w15:val="hidden"/>
               </w:sdtPr>
+              <w:sdtEndPr/>
               <w:sdtContent>
                 <w:r>
                   <w:rPr>
@@ -763,8 +807,59 @@
               </w:sdtContent>
             </w:sdt>
           </w:p>
+          <w:p>
+            <w:r>
+              <w:t xml:space="preserve">2026 – </w:t>
+            </w:r>
+            <w:proofErr w:type="spellStart"/>
+            <w:r>
+              <w:t>Boxmaker</w:t>
+            </w:r>
+            <w:proofErr w:type="spellEnd"/>
+            <w:r>
+              <w:t xml:space="preserve"> Team Lead at Zespri MPAC and loving it.</w:t>
+            </w:r>
+            <w:r>
+              <w:t xml:space="preserve"> Making box</w:t>
+            </w:r>
+            <w:r>
+              <w:t>es</w:t>
+            </w:r>
+            <w:r>
+              <w:t xml:space="preserve"> and help</w:t>
+            </w:r>
+            <w:r>
+              <w:t>ing clean and fix the machines.</w:t>
+            </w:r>
+            <w:r>
+              <w:t xml:space="preserve"> Great people! (Coming to end of season however.)</w:t>
+            </w:r>
+          </w:p>
           <w:p/>
           <w:p>
+            <w:r>
+              <w:t>2026 – Senior IT Lead for Vet Partners Tauranga (Temp contract)</w:t>
+            </w:r>
+            <w:r>
+              <w:t>.</w:t>
+            </w:r>
+          </w:p>
+          <w:p>
+            <w:r>
+              <w:t xml:space="preserve">Setting up new systems for the Vets around the TGA region </w:t>
+            </w:r>
+            <w:r>
+              <w:t>–</w:t>
+            </w:r>
+            <w:r>
+              <w:t xml:space="preserve"> </w:t>
+            </w:r>
+            <w:r>
+              <w:t>computers, printers, scanners, fobs etc.</w:t>
+            </w:r>
+          </w:p>
+          <w:p/>
+          <w:p>
             <w:pPr>
               <w:pStyle w:val="Heading1"/>
               <w:rPr>
@@ -1523,7 +1618,6 @@
                 <w:sz w:val="18"/>
                 <w:szCs w:val="16"/>
               </w:rPr>
-              <w:lastRenderedPageBreak/>
               <w:t>software consultant</w:t>
             </w:r>
           </w:p>
@@ -1718,7 +1812,15 @@
                 <w:sz w:val="18"/>
                 <w:szCs w:val="22"/>
               </w:rPr>
-              <w:t xml:space="preserve"> and managed a hostel.</w:t>
+              <w:t xml:space="preserve"> and managed a hostel</w:t>
+            </w:r>
+            <w:r>
+              <w:rPr>
+                <w:color w:val="auto"/>
+                <w:sz w:val="18"/>
+                <w:szCs w:val="22"/>
+              </w:rPr>
+              <w:t xml:space="preserve"> for many years.</w:t>
             </w:r>
           </w:p>
           <w:p>
@@ -1798,6 +1900,7 @@
                 </w:placeholder>
                 <w15:appearance w15:val="hidden"/>
               </w:sdtPr>
+              <w:sdtEndPr/>
               <w:sdtContent>
                 <w:r>
                   <w:rPr>
@@ -1805,7 +1908,7 @@
                     <w:sz w:val="18"/>
                     <w:szCs w:val="16"/>
                   </w:rPr>
-                  <w:t>NZ Citizen.</w:t>
+                  <w:t>NZ Citizen</w:t>
                 </w:r>
                 <w:r>
                   <w:rPr>
@@ -1813,63 +1916,7 @@
                     <w:sz w:val="18"/>
                     <w:szCs w:val="16"/>
                   </w:rPr>
-                  <w:t xml:space="preserve"> </w:t>
-                </w:r>
-                <w:r>
-                  <w:rPr>
-                    <w:color w:val="auto"/>
-                    <w:sz w:val="18"/>
-                    <w:szCs w:val="16"/>
-                  </w:rPr>
-                  <w:t>Permanent</w:t>
-                </w:r>
-                <w:r>
-                  <w:rPr>
-                    <w:color w:val="auto"/>
-                    <w:sz w:val="18"/>
-                    <w:szCs w:val="16"/>
-                  </w:rPr>
-                  <w:t xml:space="preserve"> Right to Work</w:t>
-                </w:r>
-                <w:r>
-                  <w:rPr>
-                    <w:color w:val="auto"/>
-                    <w:sz w:val="18"/>
-                    <w:szCs w:val="16"/>
-                  </w:rPr>
-                  <w:t xml:space="preserve"> Status</w:t>
-                </w:r>
-                <w:r>
-                  <w:rPr>
-                    <w:color w:val="auto"/>
-                    <w:sz w:val="18"/>
-                    <w:szCs w:val="16"/>
-                  </w:rPr>
-                  <w:t xml:space="preserve"> in the UK </w:t>
-                </w:r>
-                <w:r>
-                  <w:rPr>
-                    <w:color w:val="auto"/>
-                    <w:sz w:val="18"/>
-                    <w:szCs w:val="16"/>
-                  </w:rPr>
-                  <w:t>if needed. Previously employed</w:t>
-                </w:r>
-                <w:r>
-                  <w:rPr>
-                    <w:color w:val="auto"/>
-                    <w:sz w:val="18"/>
-                    <w:szCs w:val="16"/>
-                  </w:rPr>
-                  <w:t xml:space="preserve"> as the ICT Technician for St. Peter’s Academy</w:t>
-                </w:r>
-                <w:r>
-                  <w:rPr>
-                    <w:color w:val="auto"/>
-                    <w:sz w:val="18"/>
-                    <w:szCs w:val="16"/>
-                  </w:rPr>
-                  <w:t xml:space="preserve"> UK</w:t>
+                  <w:t>. Currently at Zespri MPAC as Box Maker Team Lead</w:t>
                 </w:r>
               </w:sdtContent>
             </w:sdt>
@@ -1936,7 +1983,7 @@
                 </mc:Choice>
                 <mc:Fallback>
                   <w:pict>
-                    <v:line w14:anchorId="1638100F" id="Straight Connector 3" o:spid="_x0000_s1026" alt="Decorative" style="visibility:visible;mso-wrap-style:square;mso-left-percent:-10001;mso-top-percent:-10001;mso-position-horizontal:absolute;mso-position-horizontal-relative:char;mso-position-vertical:absolute;mso-position-vertical-relative:line;mso-left-percent:-10001;mso-top-percent:-10001" from="0,0" to="126.7pt,0" o:gfxdata="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" strokecolor="#043d68 [3215]" strokeweight=".5pt">
+                    <v:line w14:anchorId="61894042" id="Straight Connector 3" o:spid="_x0000_s1026" alt="Decorative" style="visibility:visible;mso-wrap-style:square;mso-left-percent:-10001;mso-top-percent:-10001;mso-position-horizontal:absolute;mso-position-horizontal-relative:char;mso-position-vertical:absolute;mso-position-vertical-relative:line;mso-left-percent:-10001;mso-top-percent:-10001" from="0,0" to="126.7pt,0" o:gfxdata="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" strokecolor="#043d68 [3215]" strokeweight=".5pt">
                       <v:stroke joinstyle="miter"/>
                       <w10:anchorlock/>
                     </v:line>
@@ -1972,6 +2019,7 @@
                 <w:showingPlcHdr/>
                 <w15:appearance w15:val="hidden"/>
               </w:sdtPr>
+              <w:sdtEndPr/>
               <w:sdtContent>
                 <w:r>
                   <w:rPr>
@@ -2183,7 +2231,7 @@
                 </mc:Choice>
                 <mc:Fallback>
                   <w:pict>
-                    <v:line w14:anchorId="2F7CB57A" id="Straight Connector 4" o:spid="_x0000_s1026" alt="Decorative" style="visibility:visible;mso-wrap-style:square;mso-left-percent:-10001;mso-top-percent:-10001;mso-position-horizontal:absolute;mso-position-horizontal-relative:char;mso-position-vertical:absolute;mso-position-vertical-relative:line;mso-left-percent:-10001;mso-top-percent:-10001" from="0,0" to="126.7pt,0" o:gfxdata="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" strokecolor="#043d68 [3215]" strokeweight=".5pt">
+                    <v:line w14:anchorId="64C1A022" id="Straight Connector 4" o:spid="_x0000_s1026" alt="Decorative" style="visibility:visible;mso-wrap-style:square;mso-left-percent:-10001;mso-top-percent:-10001;mso-position-horizontal:absolute;mso-position-horizontal-relative:char;mso-position-vertical:absolute;mso-position-vertical-relative:line;mso-left-percent:-10001;mso-top-percent:-10001" from="0,0" to="126.7pt,0" o:gfxdata="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" strokecolor="#043d68 [3215]" strokeweight=".5pt">
                       <v:stroke joinstyle="miter"/>
                       <w10:anchorlock/>
                     </v:line>
@@ -2219,6 +2267,7 @@
                 <w:showingPlcHdr/>
                 <w15:appearance w15:val="hidden"/>
               </w:sdtPr>
+              <w:sdtEndPr/>
               <w:sdtContent>
                 <w:r>
                   <w:rPr>
@@ -2297,96 +2346,20 @@
               </w:rPr>
               <w:t>at all levels 1,2,3</w:t>
             </w:r>
+            <w:r>
+              <w:rPr>
+                <w:color w:val="auto"/>
+                <w:sz w:val="18"/>
+                <w:szCs w:val="16"/>
+              </w:rPr>
+              <w:t xml:space="preserve"> and programming. Other skills -- very fit and enjoy physical roles. Excellent (people) soft skills. </w:t>
+            </w:r>
           </w:p>
           <w:p>
             <w:pPr>
               <w:pStyle w:val="Heading2"/>
               <w:spacing w:after="0"/>
-              <w:rPr>
-                <w:color w:val="auto"/>
-                <w:sz w:val="18"/>
-                <w:szCs w:val="16"/>
-              </w:rPr>
-            </w:pPr>
-            <w:r>
-              <w:rPr>
-                <w:color w:val="auto"/>
-                <w:sz w:val="18"/>
-                <w:szCs w:val="16"/>
-              </w:rPr>
-              <w:t>Python</w:t>
-            </w:r>
-          </w:p>
-          <w:p>
-            <w:pPr>
-              <w:pStyle w:val="Heading2"/>
-              <w:spacing w:after="0"/>
-              <w:rPr>
-                <w:color w:val="auto"/>
-                <w:sz w:val="18"/>
-                <w:szCs w:val="16"/>
-              </w:rPr>
-            </w:pPr>
-            <w:r>
-              <w:rPr>
-                <w:color w:val="auto"/>
-                <w:sz w:val="18"/>
-                <w:szCs w:val="16"/>
-              </w:rPr>
-              <w:t>C and C++</w:t>
-            </w:r>
-          </w:p>
-          <w:p>
-            <w:pPr>
-              <w:pStyle w:val="Heading2"/>
-              <w:spacing w:after="0"/>
-              <w:rPr>
-                <w:color w:val="auto"/>
-                <w:sz w:val="18"/>
-                <w:szCs w:val="16"/>
-              </w:rPr>
-            </w:pPr>
-            <w:r>
-              <w:rPr>
-                <w:color w:val="auto"/>
-                <w:sz w:val="18"/>
-                <w:szCs w:val="16"/>
-              </w:rPr>
-              <w:t xml:space="preserve">C# Object Oriented </w:t>
-            </w:r>
-          </w:p>
-          <w:p>
-            <w:pPr>
-              <w:pStyle w:val="Heading2"/>
-              <w:spacing w:after="0"/>
-              <w:rPr>
-                <w:color w:val="auto"/>
-                <w:sz w:val="18"/>
-                <w:szCs w:val="16"/>
-              </w:rPr>
-            </w:pPr>
-            <w:r>
-              <w:rPr>
-                <w:color w:val="auto"/>
-                <w:sz w:val="18"/>
-                <w:szCs w:val="16"/>
-              </w:rPr>
-              <w:t xml:space="preserve">Web Development (JavaScript, CSS, HTML) </w:t>
-            </w:r>
-          </w:p>
-          <w:p>
-            <w:pPr>
-              <w:pStyle w:val="Heading2"/>
-              <w:spacing w:after="0"/>
-            </w:pPr>
-            <w:r>
-              <w:rPr>
-                <w:color w:val="auto"/>
-                <w:sz w:val="18"/>
-                <w:szCs w:val="16"/>
-              </w:rPr>
-              <w:t>Blockchain (Solidity, Hardhat, Truffle)</w:t>
-            </w:r>
+            </w:pPr>
             <w:r>
               <w:t xml:space="preserve"> </w:t>
             </w:r>
@@ -4952,6 +4925,7 @@
     <w:rsid w:val="0015065D"/>
     <w:rsid w:val="00170020"/>
     <w:rsid w:val="00190857"/>
+    <w:rsid w:val="00241FFE"/>
     <w:rsid w:val="00245126"/>
     <w:rsid w:val="002A73A9"/>
     <w:rsid w:val="003742E1"/>
@@ -4962,6 +4936,7 @@
     <w:rsid w:val="006D61EE"/>
     <w:rsid w:val="008429DB"/>
     <w:rsid w:val="009125BD"/>
+    <w:rsid w:val="00A66D28"/>
     <w:rsid w:val="00AC1DD4"/>
     <w:rsid w:val="00B21867"/>
     <w:rsid w:val="00B77AF2"/>
@@ -5710,19 +5685,26 @@
 </file>
 
 <file path=customXml/item1.xml><?xml version="1.0" encoding="utf-8"?>
-<?mso-contentType ?>
-<FormTemplates xmlns="http://schemas.microsoft.com/sharepoint/v3/contenttype/forms">
-  <Display>DocumentLibraryForm</Display>
-  <Edit>DocumentLibraryForm</Edit>
-  <New>DocumentLibraryForm</New>
-</FormTemplates>
+<p:properties xmlns:p="http://schemas.microsoft.com/office/2006/metadata/properties" xmlns:xsi="http://www.w3.org/2001/XMLSchema-instance" xmlns:pc="http://schemas.microsoft.com/office/infopath/2007/PartnerControls">
+  <documentManagement>
+    <_ip_UnifiedCompliancePolicyUIAction xmlns="http://schemas.microsoft.com/sharepoint/v3" xsi:nil="true"/>
+    <Image xmlns="71af3243-3dd4-4a8d-8c0d-dd76da1f02a5">
+      <Url xsi:nil="true"/>
+      <Description xsi:nil="true"/>
+    </Image>
+    <Status xmlns="71af3243-3dd4-4a8d-8c0d-dd76da1f02a5">Not started</Status>
+    <Background xmlns="71af3243-3dd4-4a8d-8c0d-dd76da1f02a5">false</Background>
+    <_ip_UnifiedCompliancePolicyProperties xmlns="http://schemas.microsoft.com/sharepoint/v3" xsi:nil="true"/>
+    <ImageTagsTaxHTField xmlns="71af3243-3dd4-4a8d-8c0d-dd76da1f02a5">
+      <Terms xmlns="http://schemas.microsoft.com/office/infopath/2007/PartnerControls"/>
+    </ImageTagsTaxHTField>
+    <TaxCatchAll xmlns="230e9df3-be65-4c73-a93b-d1236ebd677e" xsi:nil="true"/>
+    <MediaServiceKeyPoints xmlns="71af3243-3dd4-4a8d-8c0d-dd76da1f02a5" xsi:nil="true"/>
+  </documentManagement>
+</p:properties>
 </file>
 
 <file path=customXml/item2.xml><?xml version="1.0" encoding="utf-8"?>
-<b:Sources xmlns:b="http://schemas.openxmlformats.org/officeDocument/2006/bibliography" xmlns="http://schemas.openxmlformats.org/officeDocument/2006/bibliography" SelectedStyle="/APASixthEditionOfficeOnline.xsl" StyleName="APA" Version="6"/>
-</file>
-
-<file path=customXml/item3.xml><?xml version="1.0" encoding="utf-8"?>
 <ct:contentTypeSchema xmlns:ct="http://schemas.microsoft.com/office/2006/metadata/contentType" xmlns:ma="http://schemas.microsoft.com/office/2006/metadata/properties/metaAttributes" ct:_="" ma:_="" ma:contentTypeName="Document" ma:contentTypeID="0x01010079F111ED35F8CC479449609E8A0923A6" ma:contentTypeVersion="26" ma:contentTypeDescription="Create a new document." ma:contentTypeScope="" ma:versionID="ac37c1753acd5e330d2062ccec26ea66">
   <xsd:schema xmlns:xsd="http://www.w3.org/2001/XMLSchema" xmlns:xs="http://www.w3.org/2001/XMLSchema" xmlns:p="http://schemas.microsoft.com/office/2006/metadata/properties" xmlns:ns1="http://schemas.microsoft.com/sharepoint/v3" xmlns:ns2="71af3243-3dd4-4a8d-8c0d-dd76da1f02a5" xmlns:ns3="16c05727-aa75-4e4a-9b5f-8a80a1165891" xmlns:ns4="230e9df3-be65-4c73-a93b-d1236ebd677e" targetNamespace="http://schemas.microsoft.com/office/2006/metadata/properties" ma:root="true" ma:fieldsID="3b340c7101c92c5120abd06486f94548" ns1:_="" ns2:_="" ns3:_="" ns4:_="">
     <xsd:import namespace="http://schemas.microsoft.com/sharepoint/v3"/>
@@ -6022,43 +6004,32 @@
 </ct:contentTypeSchema>
 </file>
 
+<file path=customXml/item3.xml><?xml version="1.0" encoding="utf-8"?>
+<b:Sources xmlns:b="http://schemas.openxmlformats.org/officeDocument/2006/bibliography" xmlns="http://schemas.openxmlformats.org/officeDocument/2006/bibliography" SelectedStyle="/APASixthEditionOfficeOnline.xsl" StyleName="APA" Version="6"/>
+</file>
+
 <file path=customXml/item4.xml><?xml version="1.0" encoding="utf-8"?>
-<p:properties xmlns:p="http://schemas.microsoft.com/office/2006/metadata/properties" xmlns:xsi="http://www.w3.org/2001/XMLSchema-instance" xmlns:pc="http://schemas.microsoft.com/office/infopath/2007/PartnerControls">
-  <documentManagement>
-    <_ip_UnifiedCompliancePolicyUIAction xmlns="http://schemas.microsoft.com/sharepoint/v3" xsi:nil="true"/>
-    <Image xmlns="71af3243-3dd4-4a8d-8c0d-dd76da1f02a5">
-      <Url xsi:nil="true"/>
-      <Description xsi:nil="true"/>
-    </Image>
-    <Status xmlns="71af3243-3dd4-4a8d-8c0d-dd76da1f02a5">Not started</Status>
-    <Background xmlns="71af3243-3dd4-4a8d-8c0d-dd76da1f02a5">false</Background>
-    <_ip_UnifiedCompliancePolicyProperties xmlns="http://schemas.microsoft.com/sharepoint/v3" xsi:nil="true"/>
-    <ImageTagsTaxHTField xmlns="71af3243-3dd4-4a8d-8c0d-dd76da1f02a5">
-      <Terms xmlns="http://schemas.microsoft.com/office/infopath/2007/PartnerControls"/>
-    </ImageTagsTaxHTField>
-    <TaxCatchAll xmlns="230e9df3-be65-4c73-a93b-d1236ebd677e" xsi:nil="true"/>
-    <MediaServiceKeyPoints xmlns="71af3243-3dd4-4a8d-8c0d-dd76da1f02a5" xsi:nil="true"/>
-  </documentManagement>
-</p:properties>
+<?mso-contentType ?>
+<FormTemplates xmlns="http://schemas.microsoft.com/sharepoint/v3/contenttype/forms">
+  <Display>DocumentLibraryForm</Display>
+  <Edit>DocumentLibraryForm</Edit>
+  <New>DocumentLibraryForm</New>
+</FormTemplates>
 </file>
 
 <file path=customXml/itemProps1.xml><?xml version="1.0" encoding="utf-8"?>
-<ds:datastoreItem xmlns:ds="http://schemas.openxmlformats.org/officeDocument/2006/customXml" ds:itemID="{B5096CFC-93AE-4516-98C2-08D811E078E2}">
+<ds:datastoreItem xmlns:ds="http://schemas.openxmlformats.org/officeDocument/2006/customXml" ds:itemID="{453ACD3A-016A-4DA1-BDB8-A4D0D5066FFD}">
   <ds:schemaRefs>
-    <ds:schemaRef ds:uri="http://schemas.microsoft.com/sharepoint/v3/contenttype/forms"/>
+    <ds:schemaRef ds:uri="http://schemas.microsoft.com/office/2006/metadata/properties"/>
+    <ds:schemaRef ds:uri="http://schemas.microsoft.com/office/infopath/2007/PartnerControls"/>
+    <ds:schemaRef ds:uri="http://schemas.microsoft.com/sharepoint/v3"/>
+    <ds:schemaRef ds:uri="71af3243-3dd4-4a8d-8c0d-dd76da1f02a5"/>
+    <ds:schemaRef ds:uri="230e9df3-be65-4c73-a93b-d1236ebd677e"/>
   </ds:schemaRefs>
 </ds:datastoreItem>
 </file>
 
 <file path=customXml/itemProps2.xml><?xml version="1.0" encoding="utf-8"?>
-<ds:datastoreItem xmlns:ds="http://schemas.openxmlformats.org/officeDocument/2006/customXml" ds:itemID="{FDFCF9E5-1071-4C3D-AA44-7E8B97CFD0B3}">
-  <ds:schemaRefs>
-    <ds:schemaRef ds:uri="http://schemas.openxmlformats.org/officeDocument/2006/bibliography"/>
-  </ds:schemaRefs>
-</ds:datastoreItem>
-</file>
-
-<file path=customXml/itemProps3.xml><?xml version="1.0" encoding="utf-8"?>
 <ds:datastoreItem xmlns:ds="http://schemas.openxmlformats.org/officeDocument/2006/customXml" ds:itemID="{BC949AC9-09B6-410F-BCB1-38C226FEBCB2}">
   <ds:schemaRefs>
     <ds:schemaRef ds:uri="http://schemas.microsoft.com/office/2006/metadata/contentType"/>
@@ -6079,14 +6050,18 @@
 </ds:datastoreItem>
 </file>
 
+<file path=customXml/itemProps3.xml><?xml version="1.0" encoding="utf-8"?>
+<ds:datastoreItem xmlns:ds="http://schemas.openxmlformats.org/officeDocument/2006/customXml" ds:itemID="{FDFCF9E5-1071-4C3D-AA44-7E8B97CFD0B3}">
+  <ds:schemaRefs>
+    <ds:schemaRef ds:uri="http://schemas.openxmlformats.org/officeDocument/2006/bibliography"/>
+  </ds:schemaRefs>
+</ds:datastoreItem>
+</file>
+
 <file path=customXml/itemProps4.xml><?xml version="1.0" encoding="utf-8"?>
-<ds:datastoreItem xmlns:ds="http://schemas.openxmlformats.org/officeDocument/2006/customXml" ds:itemID="{453ACD3A-016A-4DA1-BDB8-A4D0D5066FFD}">
+<ds:datastoreItem xmlns:ds="http://schemas.openxmlformats.org/officeDocument/2006/customXml" ds:itemID="{B5096CFC-93AE-4516-98C2-08D811E078E2}">
   <ds:schemaRefs>
-    <ds:schemaRef ds:uri="http://schemas.microsoft.com/office/2006/metadata/properties"/>
-    <ds:schemaRef ds:uri="http://schemas.microsoft.com/office/infopath/2007/PartnerControls"/>
-    <ds:schemaRef ds:uri="http://schemas.microsoft.com/sharepoint/v3"/>
-    <ds:schemaRef ds:uri="71af3243-3dd4-4a8d-8c0d-dd76da1f02a5"/>
-    <ds:schemaRef ds:uri="230e9df3-be65-4c73-a93b-d1236ebd677e"/>
+    <ds:schemaRef ds:uri="http://schemas.microsoft.com/sharepoint/v3/contenttype/forms"/>
   </ds:schemaRefs>
 </ds:datastoreItem>
 </file>

</xml_diff>